<commit_message>
Report: add roll numbers
</commit_message>
<xml_diff>
--- a/docs/final_report/paper.docx
+++ b/docs/final_report/paper.docx
@@ -111,7 +111,7 @@
                 <w:rFonts w:ascii="Times New Roman" w:hAnsi="Times New Roman" w:cs="Times New Roman" w:eastAsia="Times New Roman"/>
                 <w:sz w:val="20"/>
               </w:rPr>
-              <w:t>Roll No. XX</w:t>
+              <w:t>Roll No. 43</w:t>
             </w:r>
           </w:p>
         </w:tc>
@@ -155,7 +155,7 @@
                 <w:rFonts w:ascii="Times New Roman" w:hAnsi="Times New Roman" w:cs="Times New Roman" w:eastAsia="Times New Roman"/>
                 <w:sz w:val="20"/>
               </w:rPr>
-              <w:t>Roll No. XX</w:t>
+              <w:t>Roll No. 44</w:t>
             </w:r>
           </w:p>
         </w:tc>

</xml_diff>

<commit_message>
Report: fix empty column, keep figures in order and before references, balance last page
</commit_message>
<xml_diff>
--- a/docs/final_report/paper.docx
+++ b/docs/final_report/paper.docx
@@ -7134,152 +7134,6 @@
     <w:p>
       <w:pPr>
         <w:keepNext/>
-        <w:spacing w:before="120" w:after="60" w:line="240" w:lineRule="auto"/>
-        <w:jc w:val="left"/>
-      </w:pPr>
-      <w:r>
-        <w:rPr>
-          <w:rFonts w:ascii="Times New Roman" w:hAnsi="Times New Roman" w:cs="Times New Roman" w:eastAsia="Times New Roman"/>
-          <w:i/>
-          <w:sz w:val="20"/>
-        </w:rPr>
-        <w:t>B. Each fault has its own signature</w:t>
-      </w:r>
-    </w:p>
-    <w:p>
-      <w:pPr>
-        <w:spacing w:before="0" w:after="0" w:line="240" w:lineRule="auto"/>
-        <w:ind w:firstLine="288"/>
-        <w:jc w:val="both"/>
-      </w:pPr>
-      <w:r>
-        <w:rPr>
-          <w:rFonts w:ascii="Times New Roman" w:hAnsi="Times New Roman" w:cs="Times New Roman" w:eastAsia="Times New Roman"/>
-          <w:sz w:val="20"/>
-        </w:rPr>
-        <w:t xml:space="preserve">Fig. </w:t>
-      </w:r>
-      <w:r>
-        <w:rPr>
-          <w:rFonts w:ascii="Times New Roman" w:hAnsi="Times New Roman" w:cs="Times New Roman" w:eastAsia="Times New Roman"/>
-          <w:sz w:val="20"/>
-        </w:rPr>
-        <w:t>8</w:t>
-      </w:r>
-      <w:r>
-        <w:rPr>
-          <w:rFonts w:ascii="Times New Roman" w:hAnsi="Times New Roman" w:cs="Times New Roman" w:eastAsia="Times New Roman"/>
-          <w:sz w:val="20"/>
-        </w:rPr>
-        <w:t xml:space="preserve"> plots damping against frequency for every flick. The added mass lowers </w:t>
-      </w:r>
-      <m:oMath>
-        <m:sSub>
-          <m:e>
-            <m:r>
-              <m:t>f</m:t>
-            </m:r>
-          </m:e>
-          <m:sub>
-            <m:r>
-              <m:t>1</m:t>
-            </m:r>
-          </m:sub>
-        </m:sSub>
-      </m:oMath>
-      <w:r>
-        <w:rPr>
-          <w:rFonts w:ascii="Times New Roman" w:hAnsi="Times New Roman" w:cs="Times New Roman" w:eastAsia="Times New Roman"/>
-          <w:sz w:val="20"/>
-        </w:rPr>
-        <w:t xml:space="preserve"> by 22%, as </w:t>
-      </w:r>
-      <w:r>
-        <w:rPr>
-          <w:rFonts w:ascii="Times New Roman" w:hAnsi="Times New Roman" w:cs="Times New Roman" w:eastAsia="Times New Roman"/>
-          <w:sz w:val="20"/>
-        </w:rPr>
-        <w:t>(1)</w:t>
-      </w:r>
-      <w:r>
-        <w:rPr>
-          <w:rFonts w:ascii="Times New Roman" w:hAnsi="Times New Roman" w:cs="Times New Roman" w:eastAsia="Times New Roman"/>
-          <w:sz w:val="20"/>
-        </w:rPr>
-        <w:t xml:space="preserve"> predicts for an increase in </w:t>
-      </w:r>
-      <m:oMath>
-        <m:r>
-          <m:t>m</m:t>
-        </m:r>
-      </m:oMath>
-      <w:r>
-        <w:rPr>
-          <w:rFonts w:ascii="Times New Roman" w:hAnsi="Times New Roman" w:cs="Times New Roman" w:eastAsia="Times New Roman"/>
-          <w:sz w:val="20"/>
-        </w:rPr>
-        <w:t xml:space="preserve">. Removing clips lowers </w:t>
-      </w:r>
-      <m:oMath>
-        <m:sSub>
-          <m:e>
-            <m:r>
-              <m:t>f</m:t>
-            </m:r>
-          </m:e>
-          <m:sub>
-            <m:r>
-              <m:t>1</m:t>
-            </m:r>
-          </m:sub>
-        </m:sSub>
-      </m:oMath>
-      <w:r>
-        <w:rPr>
-          <w:rFonts w:ascii="Times New Roman" w:hAnsi="Times New Roman" w:cs="Times New Roman" w:eastAsia="Times New Roman"/>
-          <w:sz w:val="20"/>
-        </w:rPr>
-        <w:t xml:space="preserve"> by about 6% through a loss of joint stiffness, and removing the second clip also lowers damping from 2.9% to 1.2%, because less friction remains at the overlap. Loosening the support does not change </w:t>
-      </w:r>
-      <m:oMath>
-        <m:sSub>
-          <m:e>
-            <m:r>
-              <m:t>f</m:t>
-            </m:r>
-          </m:e>
-          <m:sub>
-            <m:r>
-              <m:t>1</m:t>
-            </m:r>
-          </m:sub>
-        </m:sSub>
-      </m:oMath>
-      <w:r>
-        <w:rPr>
-          <w:rFonts w:ascii="Times New Roman" w:hAnsi="Times New Roman" w:cs="Times New Roman" w:eastAsia="Times New Roman"/>
-          <w:sz w:val="20"/>
-        </w:rPr>
-        <w:t xml:space="preserve"> at all (4.75 Hz against 4.74 Hz) but raises damping, since the loosely held end dissipates energy through friction, consistent with the loosening literature </w:t>
-      </w:r>
-      <w:r>
-        <w:rPr>
-          <w:rFonts w:ascii="Times New Roman" w:hAnsi="Times New Roman" w:cs="Times New Roman" w:eastAsia="Times New Roman"/>
-          <w:sz w:val="20"/>
-        </w:rPr>
-        <w:t>[11]</w:t>
-      </w:r>
-      <w:r>
-        <w:rPr>
-          <w:rFonts w:ascii="Times New Roman" w:hAnsi="Times New Roman" w:cs="Times New Roman" w:eastAsia="Times New Roman"/>
-          <w:sz w:val="20"/>
-        </w:rPr>
-        <w:t>. A frequency-only method therefore cannot see this fault.</w:t>
-      </w:r>
-    </w:p>
-    <w:p>
-      <w:pPr>
-        <w:keepNext/>
         <w:spacing w:before="120" w:after="0" w:line="240" w:lineRule="auto"/>
         <w:jc w:val="center"/>
       </w:pPr>
@@ -7341,49 +7195,6 @@
     <w:p>
       <w:pPr>
         <w:keepNext/>
-        <w:spacing w:before="120" w:after="60" w:line="240" w:lineRule="auto"/>
-        <w:jc w:val="left"/>
-      </w:pPr>
-      <w:r>
-        <w:rPr>
-          <w:rFonts w:ascii="Times New Roman" w:hAnsi="Times New Roman" w:cs="Times New Roman" w:eastAsia="Times New Roman"/>
-          <w:i/>
-          <w:sz w:val="20"/>
-        </w:rPr>
-        <w:t>C. Detection limit for support loosening</w:t>
-      </w:r>
-    </w:p>
-    <w:p>
-      <w:pPr>
-        <w:spacing w:before="0" w:after="0" w:line="240" w:lineRule="auto"/>
-        <w:ind w:firstLine="288"/>
-        <w:jc w:val="both"/>
-      </w:pPr>
-      <w:r>
-        <w:rPr>
-          <w:rFonts w:ascii="Times New Roman" w:hAnsi="Times New Roman" w:cs="Times New Roman" w:eastAsia="Times New Roman"/>
-          <w:sz w:val="20"/>
-        </w:rPr>
-        <w:t xml:space="preserve">Fig. </w:t>
-      </w:r>
-      <w:r>
-        <w:rPr>
-          <w:rFonts w:ascii="Times New Roman" w:hAnsi="Times New Roman" w:cs="Times New Roman" w:eastAsia="Times New Roman"/>
-          <w:sz w:val="20"/>
-        </w:rPr>
-        <w:t>9</w:t>
-      </w:r>
-      <w:r>
-        <w:rPr>
-          <w:rFonts w:ascii="Times New Roman" w:hAnsi="Times New Roman" w:cs="Times New Roman" w:eastAsia="Times New Roman"/>
-          <w:sz w:val="20"/>
-        </w:rPr>
-        <w:t xml:space="preserve"> shows damping at each loosening step. At 1/4 and 1/2 turn the damping lies inside the healthy spread, while at 3/4 turn every flick is above the highest healthy flick, with a median increase of 18%. The screw clamp keeps gripping the ruler until it is almost released, so the first two steps are below the detection limit of this setup. On these held-out flicks the neural network labelled 4 of 8 and 3 of 8 as loose support, and the change detector fired once, which is consistent with features that sit on the boundary of the healthy cluster.</w:t>
-      </w:r>
-    </w:p>
-    <w:p>
-      <w:pPr>
-        <w:keepNext/>
         <w:spacing w:before="120" w:after="0" w:line="240" w:lineRule="auto"/>
         <w:jc w:val="center"/>
       </w:pPr>
@@ -7440,6 +7251,256 @@
           <w:sz w:val="16"/>
         </w:rPr>
         <w:t>Damping ratio at each support-loosening step compared with the healthy range.</w:t>
+      </w:r>
+    </w:p>
+    <w:p>
+      <w:pPr>
+        <w:keepNext/>
+        <w:spacing w:before="120" w:after="0" w:line="240" w:lineRule="auto"/>
+        <w:jc w:val="center"/>
+      </w:pPr>
+      <w:r>
+        <w:drawing>
+          <wp:inline xmlns:a="http://schemas.openxmlformats.org/drawingml/2006/main" xmlns:pic="http://schemas.openxmlformats.org/drawingml/2006/picture">
+            <wp:extent cx="2955110" cy="1385208"/>
+            <wp:docPr id="12" name="Picture 12"/>
+            <wp:cNvGraphicFramePr>
+              <a:graphicFrameLocks noChangeAspect="1"/>
+            </wp:cNvGraphicFramePr>
+            <a:graphic>
+              <a:graphicData uri="http://schemas.openxmlformats.org/drawingml/2006/picture">
+                <pic:pic>
+                  <pic:nvPicPr>
+                    <pic:cNvPr id="0" name="accuracy_comparison.png"/>
+                    <pic:cNvPicPr/>
+                  </pic:nvPicPr>
+                  <pic:blipFill>
+                    <a:blip r:embed="rId20"/>
+                    <a:stretch>
+                      <a:fillRect/>
+                    </a:stretch>
+                  </pic:blipFill>
+                  <pic:spPr>
+                    <a:xfrm>
+                      <a:off x="0" y="0"/>
+                      <a:ext cx="2955110" cy="1385208"/>
+                    </a:xfrm>
+                    <a:prstGeom prst="rect"/>
+                  </pic:spPr>
+                </pic:pic>
+              </a:graphicData>
+            </a:graphic>
+          </wp:inline>
+        </w:drawing>
+      </w:r>
+    </w:p>
+    <w:p>
+      <w:pPr>
+        <w:spacing w:before="60" w:after="160" w:line="240" w:lineRule="auto"/>
+        <w:jc w:val="both"/>
+      </w:pPr>
+      <w:r>
+        <w:rPr>
+          <w:rFonts w:ascii="Times New Roman" w:hAnsi="Times New Roman" w:cs="Times New Roman" w:eastAsia="Times New Roman"/>
+          <w:sz w:val="16"/>
+        </w:rPr>
+        <w:t xml:space="preserve">Fig. 10. </w:t>
+      </w:r>
+      <w:r>
+        <w:rPr>
+          <w:rFonts w:ascii="Times New Roman" w:hAnsi="Times New Roman" w:cs="Times New Roman" w:eastAsia="Times New Roman"/>
+          <w:sz w:val="16"/>
+        </w:rPr>
+        <w:t>Accuracy of the frequency-only rule and the three classifiers.</w:t>
+      </w:r>
+    </w:p>
+    <w:p>
+      <w:pPr>
+        <w:keepNext/>
+        <w:spacing w:before="120" w:after="60" w:line="240" w:lineRule="auto"/>
+        <w:jc w:val="left"/>
+      </w:pPr>
+      <w:r>
+        <w:rPr>
+          <w:rFonts w:ascii="Times New Roman" w:hAnsi="Times New Roman" w:cs="Times New Roman" w:eastAsia="Times New Roman"/>
+          <w:i/>
+          <w:sz w:val="20"/>
+        </w:rPr>
+        <w:t>B. Each fault has its own signature</w:t>
+      </w:r>
+    </w:p>
+    <w:p>
+      <w:pPr>
+        <w:spacing w:before="0" w:after="0" w:line="240" w:lineRule="auto"/>
+        <w:ind w:firstLine="288"/>
+        <w:jc w:val="both"/>
+      </w:pPr>
+      <w:r>
+        <w:rPr>
+          <w:rFonts w:ascii="Times New Roman" w:hAnsi="Times New Roman" w:cs="Times New Roman" w:eastAsia="Times New Roman"/>
+          <w:sz w:val="20"/>
+        </w:rPr>
+        <w:t xml:space="preserve">Fig. </w:t>
+      </w:r>
+      <w:r>
+        <w:rPr>
+          <w:rFonts w:ascii="Times New Roman" w:hAnsi="Times New Roman" w:cs="Times New Roman" w:eastAsia="Times New Roman"/>
+          <w:sz w:val="20"/>
+        </w:rPr>
+        <w:t>8</w:t>
+      </w:r>
+      <w:r>
+        <w:rPr>
+          <w:rFonts w:ascii="Times New Roman" w:hAnsi="Times New Roman" w:cs="Times New Roman" w:eastAsia="Times New Roman"/>
+          <w:sz w:val="20"/>
+        </w:rPr>
+        <w:t xml:space="preserve"> plots damping against frequency for every flick. The added mass lowers </w:t>
+      </w:r>
+      <m:oMath>
+        <m:sSub>
+          <m:e>
+            <m:r>
+              <m:t>f</m:t>
+            </m:r>
+          </m:e>
+          <m:sub>
+            <m:r>
+              <m:t>1</m:t>
+            </m:r>
+          </m:sub>
+        </m:sSub>
+      </m:oMath>
+      <w:r>
+        <w:rPr>
+          <w:rFonts w:ascii="Times New Roman" w:hAnsi="Times New Roman" w:cs="Times New Roman" w:eastAsia="Times New Roman"/>
+          <w:sz w:val="20"/>
+        </w:rPr>
+        <w:t xml:space="preserve"> by 22%, as </w:t>
+      </w:r>
+      <w:r>
+        <w:rPr>
+          <w:rFonts w:ascii="Times New Roman" w:hAnsi="Times New Roman" w:cs="Times New Roman" w:eastAsia="Times New Roman"/>
+          <w:sz w:val="20"/>
+        </w:rPr>
+        <w:t>(1)</w:t>
+      </w:r>
+      <w:r>
+        <w:rPr>
+          <w:rFonts w:ascii="Times New Roman" w:hAnsi="Times New Roman" w:cs="Times New Roman" w:eastAsia="Times New Roman"/>
+          <w:sz w:val="20"/>
+        </w:rPr>
+        <w:t xml:space="preserve"> predicts for an increase in </w:t>
+      </w:r>
+      <m:oMath>
+        <m:r>
+          <m:t>m</m:t>
+        </m:r>
+      </m:oMath>
+      <w:r>
+        <w:rPr>
+          <w:rFonts w:ascii="Times New Roman" w:hAnsi="Times New Roman" w:cs="Times New Roman" w:eastAsia="Times New Roman"/>
+          <w:sz w:val="20"/>
+        </w:rPr>
+        <w:t xml:space="preserve">. Removing clips lowers </w:t>
+      </w:r>
+      <m:oMath>
+        <m:sSub>
+          <m:e>
+            <m:r>
+              <m:t>f</m:t>
+            </m:r>
+          </m:e>
+          <m:sub>
+            <m:r>
+              <m:t>1</m:t>
+            </m:r>
+          </m:sub>
+        </m:sSub>
+      </m:oMath>
+      <w:r>
+        <w:rPr>
+          <w:rFonts w:ascii="Times New Roman" w:hAnsi="Times New Roman" w:cs="Times New Roman" w:eastAsia="Times New Roman"/>
+          <w:sz w:val="20"/>
+        </w:rPr>
+        <w:t xml:space="preserve"> by about 6% through a loss of joint stiffness, and removing the second clip also lowers damping from 2.9% to 1.2%, because less friction remains at the overlap. Loosening the support does not change </w:t>
+      </w:r>
+      <m:oMath>
+        <m:sSub>
+          <m:e>
+            <m:r>
+              <m:t>f</m:t>
+            </m:r>
+          </m:e>
+          <m:sub>
+            <m:r>
+              <m:t>1</m:t>
+            </m:r>
+          </m:sub>
+        </m:sSub>
+      </m:oMath>
+      <w:r>
+        <w:rPr>
+          <w:rFonts w:ascii="Times New Roman" w:hAnsi="Times New Roman" w:cs="Times New Roman" w:eastAsia="Times New Roman"/>
+          <w:sz w:val="20"/>
+        </w:rPr>
+        <w:t xml:space="preserve"> at all (4.75 Hz against 4.74 Hz) but raises damping, since the loosely held end dissipates energy through friction, consistent with the loosening literature </w:t>
+      </w:r>
+      <w:r>
+        <w:rPr>
+          <w:rFonts w:ascii="Times New Roman" w:hAnsi="Times New Roman" w:cs="Times New Roman" w:eastAsia="Times New Roman"/>
+          <w:sz w:val="20"/>
+        </w:rPr>
+        <w:t>[11]</w:t>
+      </w:r>
+      <w:r>
+        <w:rPr>
+          <w:rFonts w:ascii="Times New Roman" w:hAnsi="Times New Roman" w:cs="Times New Roman" w:eastAsia="Times New Roman"/>
+          <w:sz w:val="20"/>
+        </w:rPr>
+        <w:t>. A frequency-only method therefore cannot see this fault.</w:t>
+      </w:r>
+    </w:p>
+    <w:p>
+      <w:pPr>
+        <w:keepNext/>
+        <w:spacing w:before="120" w:after="60" w:line="240" w:lineRule="auto"/>
+        <w:jc w:val="left"/>
+      </w:pPr>
+      <w:r>
+        <w:rPr>
+          <w:rFonts w:ascii="Times New Roman" w:hAnsi="Times New Roman" w:cs="Times New Roman" w:eastAsia="Times New Roman"/>
+          <w:i/>
+          <w:sz w:val="20"/>
+        </w:rPr>
+        <w:t>C. Detection limit for support loosening</w:t>
+      </w:r>
+    </w:p>
+    <w:p>
+      <w:pPr>
+        <w:spacing w:before="0" w:after="0" w:line="240" w:lineRule="auto"/>
+        <w:ind w:firstLine="288"/>
+        <w:jc w:val="both"/>
+      </w:pPr>
+      <w:r>
+        <w:rPr>
+          <w:rFonts w:ascii="Times New Roman" w:hAnsi="Times New Roman" w:cs="Times New Roman" w:eastAsia="Times New Roman"/>
+          <w:sz w:val="20"/>
+        </w:rPr>
+        <w:t xml:space="preserve">Fig. </w:t>
+      </w:r>
+      <w:r>
+        <w:rPr>
+          <w:rFonts w:ascii="Times New Roman" w:hAnsi="Times New Roman" w:cs="Times New Roman" w:eastAsia="Times New Roman"/>
+          <w:sz w:val="20"/>
+        </w:rPr>
+        <w:t>9</w:t>
+      </w:r>
+      <w:r>
+        <w:rPr>
+          <w:rFonts w:ascii="Times New Roman" w:hAnsi="Times New Roman" w:cs="Times New Roman" w:eastAsia="Times New Roman"/>
+          <w:sz w:val="20"/>
+        </w:rPr>
+        <w:t xml:space="preserve"> shows damping at each loosening step. At 1/4 and 1/2 turn the damping lies inside the healthy spread, while at 3/4 turn every flick is above the highest healthy flick, with a median increase of 18%. The screw clamp keeps gripping the ruler until it is almost released, so the first two steps are below the detection limit of this setup. On these held-out flicks the neural network labelled 4 of 8 and 3 of 8 as loose support, and the change detector fired once, which is consistent with features that sit on the boundary of the healthy cluster.</w:t>
       </w:r>
     </w:p>
     <w:p>
@@ -7831,79 +7892,7 @@
       <w:r>
         <w:drawing>
           <wp:inline xmlns:a="http://schemas.openxmlformats.org/drawingml/2006/main" xmlns:pic="http://schemas.openxmlformats.org/drawingml/2006/picture">
-            <wp:extent cx="2955110" cy="1385208"/>
-            <wp:docPr id="12" name="Picture 12"/>
-            <wp:cNvGraphicFramePr>
-              <a:graphicFrameLocks noChangeAspect="1"/>
-            </wp:cNvGraphicFramePr>
-            <a:graphic>
-              <a:graphicData uri="http://schemas.openxmlformats.org/drawingml/2006/picture">
-                <pic:pic>
-                  <pic:nvPicPr>
-                    <pic:cNvPr id="0" name="accuracy_comparison.png"/>
-                    <pic:cNvPicPr/>
-                  </pic:nvPicPr>
-                  <pic:blipFill>
-                    <a:blip r:embed="rId20"/>
-                    <a:stretch>
-                      <a:fillRect/>
-                    </a:stretch>
-                  </pic:blipFill>
-                  <pic:spPr>
-                    <a:xfrm>
-                      <a:off x="0" y="0"/>
-                      <a:ext cx="2955110" cy="1385208"/>
-                    </a:xfrm>
-                    <a:prstGeom prst="rect"/>
-                  </pic:spPr>
-                </pic:pic>
-              </a:graphicData>
-            </a:graphic>
-          </wp:inline>
-        </w:drawing>
-      </w:r>
-    </w:p>
-    <w:p>
-      <w:pPr>
-        <w:spacing w:before="60" w:after="160" w:line="240" w:lineRule="auto"/>
-        <w:jc w:val="both"/>
-      </w:pPr>
-      <w:r>
-        <w:rPr>
-          <w:rFonts w:ascii="Times New Roman" w:hAnsi="Times New Roman" w:cs="Times New Roman" w:eastAsia="Times New Roman"/>
-          <w:sz w:val="16"/>
-        </w:rPr>
-        <w:t xml:space="preserve">Fig. 10. </w:t>
-      </w:r>
-      <w:r>
-        <w:rPr>
-          <w:rFonts w:ascii="Times New Roman" w:hAnsi="Times New Roman" w:cs="Times New Roman" w:eastAsia="Times New Roman"/>
-          <w:sz w:val="16"/>
-        </w:rPr>
-        <w:t>Accuracy of the frequency-only rule and the three classifiers.</w:t>
-      </w:r>
-    </w:p>
-    <w:p>
-      <w:pPr>
-        <w:sectPr>
-          <w:type w:val="continuous"/>
-          <w:pgSz w:w="12240" w:h="15840"/>
-          <w:pgMar w:top="1080" w:right="900" w:bottom="1440" w:left="900" w:header="720" w:footer="720" w:gutter="0"/>
-          <w:cols w:space="288" w:num="2"/>
-          <w:docGrid w:linePitch="360"/>
-        </w:sectPr>
-      </w:pPr>
-    </w:p>
-    <w:p>
-      <w:pPr>
-        <w:keepNext/>
-        <w:spacing w:before="120" w:after="0" w:line="240" w:lineRule="auto"/>
-        <w:jc w:val="center"/>
-      </w:pPr>
-      <w:r>
-        <w:drawing>
-          <wp:inline xmlns:a="http://schemas.openxmlformats.org/drawingml/2006/main" xmlns:pic="http://schemas.openxmlformats.org/drawingml/2006/picture">
-            <wp:extent cx="6080302" cy="1976098"/>
+            <wp:extent cx="2955111" cy="960411"/>
             <wp:docPr id="13" name="Picture 13"/>
             <wp:cNvGraphicFramePr>
               <a:graphicFrameLocks noChangeAspect="1"/>
@@ -7924,7 +7913,7 @@
                   <pic:spPr>
                     <a:xfrm>
                       <a:off x="0" y="0"/>
-                      <a:ext cx="6080302" cy="1976098"/>
+                      <a:ext cx="2955111" cy="960411"/>
                     </a:xfrm>
                     <a:prstGeom prst="rect"/>
                   </pic:spPr>
@@ -7952,19 +7941,8 @@
           <w:rFonts w:ascii="Times New Roman" w:hAnsi="Times New Roman" w:cs="Times New Roman" w:eastAsia="Times New Roman"/>
           <w:sz w:val="16"/>
         </w:rPr>
-        <w:t>Confusion matrices from cross-validation.</w:t>
-      </w:r>
-    </w:p>
-    <w:p>
-      <w:pPr>
-        <w:sectPr>
-          <w:type w:val="continuous"/>
-          <w:pgSz w:w="12240" w:h="15840"/>
-          <w:pgMar w:top="1080" w:right="900" w:bottom="1440" w:left="900" w:header="720" w:footer="720" w:gutter="0"/>
-          <w:cols w:space="288" w:num="1"/>
-          <w:docGrid w:linePitch="360"/>
-        </w:sectPr>
-      </w:pPr>
+        <w:t>Confusion matrices from cross-validation (left to right: frequency only, decision tree, neural network).</w:t>
+      </w:r>
     </w:p>
     <w:p>
       <w:pPr>
@@ -8022,17 +8000,6 @@
         </w:rPr>
         <w:t>, right).</w:t>
       </w:r>
-    </w:p>
-    <w:p>
-      <w:pPr>
-        <w:sectPr>
-          <w:type w:val="continuous"/>
-          <w:pgSz w:w="12240" w:h="15840"/>
-          <w:pgMar w:top="1080" w:right="900" w:bottom="1440" w:left="900" w:header="720" w:footer="720" w:gutter="0"/>
-          <w:cols w:space="288" w:num="2"/>
-          <w:docGrid w:linePitch="360"/>
-        </w:sectPr>
-      </w:pPr>
     </w:p>
     <w:tbl>
       <w:tblPr>
@@ -8047,7 +8014,7 @@
       <w:tr>
         <w:tc>
           <w:tcPr>
-            <w:tcW w:type="dxa" w:w="4216"/>
+            <w:tcW w:type="dxa" w:w="2047"/>
           </w:tcPr>
           <w:p>
             <w:pPr>
@@ -8057,7 +8024,7 @@
             <w:r>
               <w:drawing>
                 <wp:inline xmlns:a="http://schemas.openxmlformats.org/drawingml/2006/main" xmlns:pic="http://schemas.openxmlformats.org/drawingml/2006/picture">
-                  <wp:extent cx="2585767" cy="2187957"/>
+                  <wp:extent cx="1208565" cy="1022632"/>
                   <wp:docPr id="14" name="Picture 14"/>
                   <wp:cNvGraphicFramePr>
                     <a:graphicFrameLocks noChangeAspect="1"/>
@@ -8078,7 +8045,7 @@
                         <pic:spPr>
                           <a:xfrm>
                             <a:off x="0" y="0"/>
-                            <a:ext cx="2585767" cy="2187957"/>
+                            <a:ext cx="1208565" cy="1022632"/>
                           </a:xfrm>
                           <a:prstGeom prst="rect"/>
                         </pic:spPr>
@@ -8092,7 +8059,7 @@
         </w:tc>
         <w:tc>
           <w:tcPr>
-            <w:tcW w:type="dxa" w:w="5312"/>
+            <w:tcW w:type="dxa" w:w="2560"/>
           </w:tcPr>
           <w:p>
             <w:pPr>
@@ -8102,7 +8069,7 @@
             <w:r>
               <w:drawing>
                 <wp:inline xmlns:a="http://schemas.openxmlformats.org/drawingml/2006/main" xmlns:pic="http://schemas.openxmlformats.org/drawingml/2006/picture">
-                  <wp:extent cx="3281936" cy="2187957"/>
+                  <wp:extent cx="1533948" cy="1022632"/>
                   <wp:docPr id="15" name="Picture 15"/>
                   <wp:cNvGraphicFramePr>
                     <a:graphicFrameLocks noChangeAspect="1"/>
@@ -8123,7 +8090,7 @@
                         <pic:spPr>
                           <a:xfrm>
                             <a:off x="0" y="0"/>
-                            <a:ext cx="3281936" cy="2187957"/>
+                            <a:ext cx="1533948" cy="1022632"/>
                           </a:xfrm>
                           <a:prstGeom prst="rect"/>
                         </pic:spPr>
@@ -8156,17 +8123,6 @@
         </w:rPr>
         <w:t>Left: predicted against true health score. Right: health over successive loosening steps and the predicted unsafe point.</w:t>
       </w:r>
-    </w:p>
-    <w:p>
-      <w:pPr>
-        <w:sectPr>
-          <w:type w:val="continuous"/>
-          <w:pgSz w:w="12240" w:h="15840"/>
-          <w:pgMar w:top="1080" w:right="900" w:bottom="1440" w:left="900" w:header="720" w:footer="720" w:gutter="0"/>
-          <w:cols w:space="288" w:num="1"/>
-          <w:docGrid w:linePitch="360"/>
-        </w:sectPr>
-      </w:pPr>
     </w:p>
     <w:p>
       <w:pPr>

</xml_diff>

<commit_message>
Report: clearer block diagram (100 MHz CPU vs 100 Hz sampling), fixed humanized Word file, first-person viva sheet
</commit_message>
<xml_diff>
--- a/docs/final_report/paper.docx
+++ b/docs/final_report/paper.docx
@@ -1136,7 +1136,7 @@
           <w:rFonts w:ascii="Times New Roman" w:hAnsi="Times New Roman" w:cs="Times New Roman" w:eastAsia="Times New Roman"/>
           <w:sz w:val="20"/>
         </w:rPr>
-        <w:t xml:space="preserve"> summarises the closest works. Existing edge SHM studies use capable processors and anomaly-only or black-box models, while the beam classification studies run on a PC. None of them combines fault-type classification, a severity score and a change detector on a basic Cortex-M3, verified against real data with bit-level agreement between the PC and the board.</w:t>
+        <w:t xml:space="preserve"> summarises the closest works. Existing edge SHM studies use capable processors and anomaly-only or black-box models, while the beam classification studies run on a PC. None of them combines fault-type classification, a severity score and a change detector on a basic Cortex-M3, verified against real data with identical outputs from the PC and the board.</w:t>
       </w:r>
     </w:p>
     <w:p>
@@ -2434,7 +2434,7 @@
           <w:rFonts w:ascii="Times New Roman" w:hAnsi="Times New Roman" w:cs="Times New Roman" w:eastAsia="Times New Roman"/>
           <w:sz w:val="20"/>
         </w:rPr>
-        <w:t xml:space="preserve">C bus on two GPIO pins, with the range set to </w:t>
+        <w:t xml:space="preserve">C bus on two GPIO pins, with its measuring range set to </w:t>
       </w:r>
       <m:oMath>
         <m:r>
@@ -2452,7 +2452,7 @@
           <w:rFonts w:ascii="Times New Roman" w:hAnsi="Times New Roman" w:cs="Times New Roman" w:eastAsia="Times New Roman"/>
           <w:sz w:val="20"/>
         </w:rPr>
-        <w:t xml:space="preserve"> g and the internal low-pass filter at 44 Hz to prevent aliasing. Timer 0 triggers a reading every 10 ms. The board's 16</w:t>
+        <w:t xml:space="preserve"> g, so it can read accelerations up to four times gravity in either direction, and its internal low-pass filter set to 44 Hz to prevent aliasing. Timer 0 triggers a reading every 10 ms. The board's 16</w:t>
       </w:r>
       <m:oMath>
         <m:r>
@@ -2494,7 +2494,7 @@
       <w:r>
         <w:drawing>
           <wp:inline xmlns:a="http://schemas.openxmlformats.org/drawingml/2006/main" xmlns:pic="http://schemas.openxmlformats.org/drawingml/2006/picture">
-            <wp:extent cx="2955112" cy="1710695"/>
+            <wp:extent cx="2955111" cy="1795472"/>
             <wp:docPr id="6" name="Picture 6"/>
             <wp:cNvGraphicFramePr>
               <a:graphicFrameLocks noChangeAspect="1"/>
@@ -2515,7 +2515,7 @@
                   <pic:spPr>
                     <a:xfrm>
                       <a:off x="0" y="0"/>
-                      <a:ext cx="2955112" cy="1710695"/>
+                      <a:ext cx="2955111" cy="1795472"/>
                     </a:xfrm>
                     <a:prstGeom prst="rect"/>
                   </pic:spPr>

</xml_diff>

<commit_message>
Report: tighter photo pairs, straightened board photo, eq 3 fits, refreshed PDFs and Overleaf zip
</commit_message>
<xml_diff>
--- a/docs/final_report/paper.docx
+++ b/docs/final_report/paper.docx
@@ -2133,109 +2133,47 @@
         <w:t>: the G-clamp screw loosened in three steps of about 1/4, 1/2 and 3/4 turn; 3/4 turn is the loosest setting at which the beam still stays in place.</w:t>
       </w:r>
     </w:p>
-    <w:tbl>
-      <w:tblPr>
-        <w:tblW w:type="auto" w:w="0"/>
+    <w:p>
+      <w:pPr>
+        <w:keepNext/>
+        <w:spacing w:before="120" w:after="0" w:line="240" w:lineRule="auto"/>
         <w:jc w:val="center"/>
-        <w:tblLook w:firstColumn="1" w:firstRow="1" w:lastColumn="0" w:lastRow="0" w:noHBand="0" w:noVBand="1" w:val="04A0"/>
-      </w:tblPr>
-      <w:tblGrid>
-        <w:gridCol w:w="5220"/>
-        <w:gridCol w:w="5220"/>
-      </w:tblGrid>
-      <w:tr>
-        <w:tc>
-          <w:tcPr>
-            <w:tcW w:type="dxa" w:w="1699"/>
-          </w:tcPr>
-          <w:p>
-            <w:pPr>
-              <w:spacing w:after="0"/>
-              <w:jc w:val="center"/>
-            </w:pPr>
-            <w:r>
-              <w:drawing>
-                <wp:inline xmlns:a="http://schemas.openxmlformats.org/drawingml/2006/main" xmlns:pic="http://schemas.openxmlformats.org/drawingml/2006/picture">
-                  <wp:extent cx="987304" cy="1316406"/>
-                  <wp:docPr id="2" name="Picture 2"/>
-                  <wp:cNvGraphicFramePr>
-                    <a:graphicFrameLocks noChangeAspect="1"/>
-                  </wp:cNvGraphicFramePr>
-                  <a:graphic>
-                    <a:graphicData uri="http://schemas.openxmlformats.org/drawingml/2006/picture">
-                      <pic:pic>
-                        <pic:nvPicPr>
-                          <pic:cNvPr id="0" name="photo_setup_coin.jpg"/>
-                          <pic:cNvPicPr/>
-                        </pic:nvPicPr>
-                        <pic:blipFill>
-                          <a:blip r:embed="rId10"/>
-                          <a:stretch>
-                            <a:fillRect/>
-                          </a:stretch>
-                        </pic:blipFill>
-                        <pic:spPr>
-                          <a:xfrm>
-                            <a:off x="0" y="0"/>
-                            <a:ext cx="987304" cy="1316406"/>
-                          </a:xfrm>
-                          <a:prstGeom prst="rect"/>
-                        </pic:spPr>
-                      </pic:pic>
-                    </a:graphicData>
-                  </a:graphic>
-                </wp:inline>
-              </w:drawing>
-            </w:r>
-          </w:p>
-        </w:tc>
-        <w:tc>
-          <w:tcPr>
-            <w:tcW w:type="dxa" w:w="2908"/>
-          </w:tcPr>
-          <w:p>
-            <w:pPr>
-              <w:spacing w:after="0"/>
-              <w:jc w:val="center"/>
-            </w:pPr>
-            <w:r>
-              <w:drawing>
-                <wp:inline xmlns:a="http://schemas.openxmlformats.org/drawingml/2006/main" xmlns:pic="http://schemas.openxmlformats.org/drawingml/2006/picture">
-                  <wp:extent cx="1755208" cy="1316406"/>
-                  <wp:docPr id="3" name="Picture 3"/>
-                  <wp:cNvGraphicFramePr>
-                    <a:graphicFrameLocks noChangeAspect="1"/>
-                  </wp:cNvGraphicFramePr>
-                  <a:graphic>
-                    <a:graphicData uri="http://schemas.openxmlformats.org/drawingml/2006/picture">
-                      <pic:pic>
-                        <pic:nvPicPr>
-                          <pic:cNvPr id="0" name="photo_setup_top.jpg"/>
-                          <pic:cNvPicPr/>
-                        </pic:nvPicPr>
-                        <pic:blipFill>
-                          <a:blip r:embed="rId11"/>
-                          <a:stretch>
-                            <a:fillRect/>
-                          </a:stretch>
-                        </pic:blipFill>
-                        <pic:spPr>
-                          <a:xfrm>
-                            <a:off x="0" y="0"/>
-                            <a:ext cx="1755208" cy="1316406"/>
-                          </a:xfrm>
-                          <a:prstGeom prst="rect"/>
-                        </pic:spPr>
-                      </pic:pic>
-                    </a:graphicData>
-                  </a:graphic>
-                </wp:inline>
-              </w:drawing>
-            </w:r>
-          </w:p>
-        </w:tc>
-      </w:tr>
-    </w:tbl>
+      </w:pPr>
+      <w:r>
+        <w:drawing>
+          <wp:inline xmlns:a="http://schemas.openxmlformats.org/drawingml/2006/main" xmlns:pic="http://schemas.openxmlformats.org/drawingml/2006/picture">
+            <wp:extent cx="2955111" cy="1403853"/>
+            <wp:docPr id="2" name="Picture 2"/>
+            <wp:cNvGraphicFramePr>
+              <a:graphicFrameLocks noChangeAspect="1"/>
+            </wp:cNvGraphicFramePr>
+            <a:graphic>
+              <a:graphicData uri="http://schemas.openxmlformats.org/drawingml/2006/picture">
+                <pic:pic>
+                  <pic:nvPicPr>
+                    <pic:cNvPr id="0" name="photo_pair_setup.jpg"/>
+                    <pic:cNvPicPr/>
+                  </pic:nvPicPr>
+                  <pic:blipFill>
+                    <a:blip r:embed="rId10"/>
+                    <a:stretch>
+                      <a:fillRect/>
+                    </a:stretch>
+                  </pic:blipFill>
+                  <pic:spPr>
+                    <a:xfrm>
+                      <a:off x="0" y="0"/>
+                      <a:ext cx="2955111" cy="1403853"/>
+                    </a:xfrm>
+                    <a:prstGeom prst="rect"/>
+                  </pic:spPr>
+                </pic:pic>
+              </a:graphicData>
+            </a:graphic>
+          </wp:inline>
+        </w:drawing>
+      </w:r>
+    </w:p>
     <w:p>
       <w:pPr>
         <w:spacing w:before="60" w:after="160" w:line="240" w:lineRule="auto"/>
@@ -2256,109 +2194,47 @@
         <w:t>Experimental setup. Left: LPC1768 board, power supply and the clamped two-ruler cantilever with the MPU6050 near the tip. Right: side view showing the three binder clips, the G-clamp and the wiring to the board.</w:t>
       </w:r>
     </w:p>
-    <w:tbl>
-      <w:tblPr>
-        <w:tblW w:type="auto" w:w="0"/>
+    <w:p>
+      <w:pPr>
+        <w:keepNext/>
+        <w:spacing w:before="120" w:after="0" w:line="240" w:lineRule="auto"/>
         <w:jc w:val="center"/>
-        <w:tblLook w:firstColumn="1" w:firstRow="1" w:lastColumn="0" w:lastRow="0" w:noHBand="0" w:noVBand="1" w:val="04A0"/>
-      </w:tblPr>
-      <w:tblGrid>
-        <w:gridCol w:w="5220"/>
-        <w:gridCol w:w="5220"/>
-      </w:tblGrid>
-      <w:tr>
-        <w:tc>
-          <w:tcPr>
-            <w:tcW w:type="dxa" w:w="2303"/>
-          </w:tcPr>
-          <w:p>
-            <w:pPr>
-              <w:spacing w:after="0"/>
-              <w:jc w:val="center"/>
-            </w:pPr>
-            <w:r>
-              <w:drawing>
-                <wp:inline xmlns:a="http://schemas.openxmlformats.org/drawingml/2006/main" xmlns:pic="http://schemas.openxmlformats.org/drawingml/2006/picture">
-                  <wp:extent cx="1371256" cy="1828342"/>
-                  <wp:docPr id="4" name="Picture 4"/>
-                  <wp:cNvGraphicFramePr>
-                    <a:graphicFrameLocks noChangeAspect="1"/>
-                  </wp:cNvGraphicFramePr>
-                  <a:graphic>
-                    <a:graphicData uri="http://schemas.openxmlformats.org/drawingml/2006/picture">
-                      <pic:pic>
-                        <pic:nvPicPr>
-                          <pic:cNvPr id="0" name="photo_coin_close.jpg"/>
-                          <pic:cNvPicPr/>
-                        </pic:nvPicPr>
-                        <pic:blipFill>
-                          <a:blip r:embed="rId12"/>
-                          <a:stretch>
-                            <a:fillRect/>
-                          </a:stretch>
-                        </pic:blipFill>
-                        <pic:spPr>
-                          <a:xfrm>
-                            <a:off x="0" y="0"/>
-                            <a:ext cx="1371256" cy="1828342"/>
-                          </a:xfrm>
-                          <a:prstGeom prst="rect"/>
-                        </pic:spPr>
-                      </pic:pic>
-                    </a:graphicData>
-                  </a:graphic>
-                </wp:inline>
-              </w:drawing>
-            </w:r>
-          </w:p>
-        </w:tc>
-        <w:tc>
-          <w:tcPr>
-            <w:tcW w:type="dxa" w:w="2303"/>
-          </w:tcPr>
-          <w:p>
-            <w:pPr>
-              <w:spacing w:after="0"/>
-              <w:jc w:val="center"/>
-            </w:pPr>
-            <w:r>
-              <w:drawing>
-                <wp:inline xmlns:a="http://schemas.openxmlformats.org/drawingml/2006/main" xmlns:pic="http://schemas.openxmlformats.org/drawingml/2006/picture">
-                  <wp:extent cx="1371256" cy="1828342"/>
-                  <wp:docPr id="5" name="Picture 5"/>
-                  <wp:cNvGraphicFramePr>
-                    <a:graphicFrameLocks noChangeAspect="1"/>
-                  </wp:cNvGraphicFramePr>
-                  <a:graphic>
-                    <a:graphicData uri="http://schemas.openxmlformats.org/drawingml/2006/picture">
-                      <pic:pic>
-                        <pic:nvPicPr>
-                          <pic:cNvPr id="0" name="photo_joint_removed.jpg"/>
-                          <pic:cNvPicPr/>
-                        </pic:nvPicPr>
-                        <pic:blipFill>
-                          <a:blip r:embed="rId13"/>
-                          <a:stretch>
-                            <a:fillRect/>
-                          </a:stretch>
-                        </pic:blipFill>
-                        <pic:spPr>
-                          <a:xfrm>
-                            <a:off x="0" y="0"/>
-                            <a:ext cx="1371256" cy="1828342"/>
-                          </a:xfrm>
-                          <a:prstGeom prst="rect"/>
-                        </pic:spPr>
-                      </pic:pic>
-                    </a:graphicData>
-                  </a:graphic>
-                </wp:inline>
-              </w:drawing>
-            </w:r>
-          </w:p>
-        </w:tc>
-      </w:tr>
-    </w:tbl>
+      </w:pPr>
+      <w:r>
+        <w:drawing>
+          <wp:inline xmlns:a="http://schemas.openxmlformats.org/drawingml/2006/main" xmlns:pic="http://schemas.openxmlformats.org/drawingml/2006/picture">
+            <wp:extent cx="2955112" cy="1942327"/>
+            <wp:docPr id="3" name="Picture 3"/>
+            <wp:cNvGraphicFramePr>
+              <a:graphicFrameLocks noChangeAspect="1"/>
+            </wp:cNvGraphicFramePr>
+            <a:graphic>
+              <a:graphicData uri="http://schemas.openxmlformats.org/drawingml/2006/picture">
+                <pic:pic>
+                  <pic:nvPicPr>
+                    <pic:cNvPr id="0" name="photo_pair_faults.jpg"/>
+                    <pic:cNvPicPr/>
+                  </pic:nvPicPr>
+                  <pic:blipFill>
+                    <a:blip r:embed="rId11"/>
+                    <a:stretch>
+                      <a:fillRect/>
+                    </a:stretch>
+                  </pic:blipFill>
+                  <pic:spPr>
+                    <a:xfrm>
+                      <a:off x="0" y="0"/>
+                      <a:ext cx="2955112" cy="1942327"/>
+                    </a:xfrm>
+                    <a:prstGeom prst="rect"/>
+                  </pic:spPr>
+                </pic:pic>
+              </a:graphicData>
+            </a:graphic>
+          </wp:inline>
+        </w:drawing>
+      </w:r>
+    </w:p>
     <w:p>
       <w:pPr>
         <w:spacing w:before="60" w:after="160" w:line="240" w:lineRule="auto"/>
@@ -2495,7 +2371,7 @@
         <w:drawing>
           <wp:inline xmlns:a="http://schemas.openxmlformats.org/drawingml/2006/main" xmlns:pic="http://schemas.openxmlformats.org/drawingml/2006/picture">
             <wp:extent cx="2955111" cy="1795472"/>
-            <wp:docPr id="6" name="Picture 6"/>
+            <wp:docPr id="4" name="Picture 4"/>
             <wp:cNvGraphicFramePr>
               <a:graphicFrameLocks noChangeAspect="1"/>
             </wp:cNvGraphicFramePr>
@@ -2507,7 +2383,7 @@
                     <pic:cNvPicPr/>
                   </pic:nvPicPr>
                   <pic:blipFill>
-                    <a:blip r:embed="rId14"/>
+                    <a:blip r:embed="rId12"/>
                     <a:stretch>
                       <a:fillRect/>
                     </a:stretch>
@@ -2555,8 +2431,8 @@
       <w:r>
         <w:drawing>
           <wp:inline xmlns:a="http://schemas.openxmlformats.org/drawingml/2006/main" xmlns:pic="http://schemas.openxmlformats.org/drawingml/2006/picture">
-            <wp:extent cx="2955112" cy="2216334"/>
-            <wp:docPr id="7" name="Picture 7"/>
+            <wp:extent cx="2955111" cy="2045846"/>
+            <wp:docPr id="5" name="Picture 5"/>
             <wp:cNvGraphicFramePr>
               <a:graphicFrameLocks noChangeAspect="1"/>
             </wp:cNvGraphicFramePr>
@@ -2568,7 +2444,7 @@
                     <pic:cNvPicPr/>
                   </pic:nvPicPr>
                   <pic:blipFill>
-                    <a:blip r:embed="rId15"/>
+                    <a:blip r:embed="rId13"/>
                     <a:stretch>
                       <a:fillRect/>
                     </a:stretch>
@@ -2576,7 +2452,7 @@
                   <pic:spPr>
                     <a:xfrm>
                       <a:off x="0" y="0"/>
-                      <a:ext cx="2955112" cy="2216334"/>
+                      <a:ext cx="2955111" cy="2045846"/>
                     </a:xfrm>
                     <a:prstGeom prst="rect"/>
                   </pic:spPr>
@@ -3110,11 +2986,32 @@
           <m:rPr>
             <m:sty m:val="p"/>
           </m:rPr>
-          <m:t>,</m:t>
+          <m:t>.</m:t>
         </m:r>
-        <m:r>
-          <m:t>  </m:t>
-        </m:r>
+      </m:oMath>
+      <w:r>
+        <w:rPr>
+          <w:rFonts w:ascii="Times New Roman" w:hAnsi="Times New Roman" w:cs="Times New Roman" w:eastAsia="Times New Roman"/>
+          <w:sz w:val="20"/>
+        </w:rPr>
+        <w:tab/>
+        <w:t>(3)</w:t>
+      </w:r>
+    </w:p>
+    <w:p>
+      <w:pPr>
+        <w:spacing w:before="0" w:after="0" w:line="240" w:lineRule="auto"/>
+        <w:ind w:firstLine="288"/>
+        <w:jc w:val="both"/>
+      </w:pPr>
+      <w:r>
+        <w:rPr>
+          <w:rFonts w:ascii="Times New Roman" w:hAnsi="Times New Roman" w:cs="Times New Roman" w:eastAsia="Times New Roman"/>
+          <w:sz w:val="20"/>
+        </w:rPr>
+        <w:t xml:space="preserve">The bin width is </w:t>
+      </w:r>
+      <m:oMath>
         <m:r>
           <m:t>Δ</m:t>
         </m:r>
@@ -3127,30 +3024,27 @@
           </m:rPr>
           <m:t>=</m:t>
         </m:r>
-        <m:f>
-          <m:fPr>
-            <m:type m:val="bar"/>
-          </m:fPr>
-          <m:num>
-            <m:sSub>
-              <m:e>
-                <m:r>
-                  <m:t>F</m:t>
-                </m:r>
-              </m:e>
-              <m:sub>
-                <m:r>
-                  <m:t>s</m:t>
-                </m:r>
-              </m:sub>
-            </m:sSub>
-          </m:num>
-          <m:den>
+        <m:sSub>
+          <m:e>
             <m:r>
-              <m:t>N</m:t>
+              <m:t>F</m:t>
             </m:r>
-          </m:den>
-        </m:f>
+          </m:e>
+          <m:sub>
+            <m:r>
+              <m:t>s</m:t>
+            </m:r>
+          </m:sub>
+        </m:sSub>
+        <m:r>
+          <m:rPr>
+            <m:sty m:val="p"/>
+          </m:rPr>
+          <m:t>/</m:t>
+        </m:r>
+        <m:r>
+          <m:t>N</m:t>
+        </m:r>
         <m:r>
           <m:rPr>
             <m:sty m:val="p"/>
@@ -3160,44 +3054,13 @@
         <m:r>
           <m:t>0.098</m:t>
         </m:r>
-        <m:r>
-          <m:t> </m:t>
-        </m:r>
-        <m:r>
-          <m:rPr>
-            <m:nor/>
-            <m:sty m:val="p"/>
-          </m:rPr>
-          <m:t>Hz</m:t>
-        </m:r>
-        <m:r>
-          <m:rPr>
-            <m:sty m:val="p"/>
-          </m:rPr>
-          <m:t>.</m:t>
-        </m:r>
       </m:oMath>
       <w:r>
         <w:rPr>
           <w:rFonts w:ascii="Times New Roman" w:hAnsi="Times New Roman" w:cs="Times New Roman" w:eastAsia="Times New Roman"/>
           <w:sz w:val="20"/>
         </w:rPr>
-        <w:tab/>
-        <w:t>(3)</w:t>
-      </w:r>
-    </w:p>
-    <w:p>
-      <w:pPr>
-        <w:spacing w:before="0" w:after="0" w:line="240" w:lineRule="auto"/>
-        <w:ind w:firstLine="288"/>
-        <w:jc w:val="both"/>
-      </w:pPr>
-      <w:r>
-        <w:rPr>
-          <w:rFonts w:ascii="Times New Roman" w:hAnsi="Times New Roman" w:cs="Times New Roman" w:eastAsia="Times New Roman"/>
-          <w:sz w:val="20"/>
-        </w:rPr>
-        <w:t xml:space="preserve">The largest bin </w:t>
+        <w:t xml:space="preserve"> Hz, and the largest bin </w:t>
       </w:r>
       <m:oMath>
         <m:sSub>
@@ -5423,7 +5286,7 @@
         <w:drawing>
           <wp:inline xmlns:a="http://schemas.openxmlformats.org/drawingml/2006/main" xmlns:pic="http://schemas.openxmlformats.org/drawingml/2006/picture">
             <wp:extent cx="2688336" cy="3840480"/>
-            <wp:docPr id="8" name="Picture 8"/>
+            <wp:docPr id="6" name="Picture 6"/>
             <wp:cNvGraphicFramePr>
               <a:graphicFrameLocks noChangeAspect="1"/>
             </wp:cNvGraphicFramePr>
@@ -5435,7 +5298,7 @@
                     <pic:cNvPicPr/>
                   </pic:nvPicPr>
                   <pic:blipFill>
-                    <a:blip r:embed="rId16"/>
+                    <a:blip r:embed="rId14"/>
                     <a:stretch>
                       <a:fillRect/>
                     </a:stretch>
@@ -7080,7 +6943,7 @@
         <w:drawing>
           <wp:inline xmlns:a="http://schemas.openxmlformats.org/drawingml/2006/main" xmlns:pic="http://schemas.openxmlformats.org/drawingml/2006/picture">
             <wp:extent cx="2955110" cy="1385208"/>
-            <wp:docPr id="9" name="Picture 9"/>
+            <wp:docPr id="7" name="Picture 7"/>
             <wp:cNvGraphicFramePr>
               <a:graphicFrameLocks noChangeAspect="1"/>
             </wp:cNvGraphicFramePr>
@@ -7092,7 +6955,7 @@
                     <pic:cNvPicPr/>
                   </pic:nvPicPr>
                   <pic:blipFill>
-                    <a:blip r:embed="rId17"/>
+                    <a:blip r:embed="rId15"/>
                     <a:stretch>
                       <a:fillRect/>
                     </a:stretch>
@@ -7141,7 +7004,7 @@
         <w:drawing>
           <wp:inline xmlns:a="http://schemas.openxmlformats.org/drawingml/2006/main" xmlns:pic="http://schemas.openxmlformats.org/drawingml/2006/picture">
             <wp:extent cx="2955111" cy="2031639"/>
-            <wp:docPr id="10" name="Picture 10"/>
+            <wp:docPr id="8" name="Picture 8"/>
             <wp:cNvGraphicFramePr>
               <a:graphicFrameLocks noChangeAspect="1"/>
             </wp:cNvGraphicFramePr>
@@ -7153,7 +7016,7 @@
                     <pic:cNvPicPr/>
                   </pic:nvPicPr>
                   <pic:blipFill>
-                    <a:blip r:embed="rId18"/>
+                    <a:blip r:embed="rId16"/>
                     <a:stretch>
                       <a:fillRect/>
                     </a:stretch>
@@ -7202,7 +7065,7 @@
         <w:drawing>
           <wp:inline xmlns:a="http://schemas.openxmlformats.org/drawingml/2006/main" xmlns:pic="http://schemas.openxmlformats.org/drawingml/2006/picture">
             <wp:extent cx="2955112" cy="1871571"/>
-            <wp:docPr id="11" name="Picture 11"/>
+            <wp:docPr id="9" name="Picture 9"/>
             <wp:cNvGraphicFramePr>
               <a:graphicFrameLocks noChangeAspect="1"/>
             </wp:cNvGraphicFramePr>
@@ -7214,7 +7077,7 @@
                     <pic:cNvPicPr/>
                   </pic:nvPicPr>
                   <pic:blipFill>
-                    <a:blip r:embed="rId19"/>
+                    <a:blip r:embed="rId17"/>
                     <a:stretch>
                       <a:fillRect/>
                     </a:stretch>
@@ -7263,7 +7126,7 @@
         <w:drawing>
           <wp:inline xmlns:a="http://schemas.openxmlformats.org/drawingml/2006/main" xmlns:pic="http://schemas.openxmlformats.org/drawingml/2006/picture">
             <wp:extent cx="2955110" cy="1385208"/>
-            <wp:docPr id="12" name="Picture 12"/>
+            <wp:docPr id="10" name="Picture 10"/>
             <wp:cNvGraphicFramePr>
               <a:graphicFrameLocks noChangeAspect="1"/>
             </wp:cNvGraphicFramePr>
@@ -7275,7 +7138,7 @@
                     <pic:cNvPicPr/>
                   </pic:nvPicPr>
                   <pic:blipFill>
-                    <a:blip r:embed="rId20"/>
+                    <a:blip r:embed="rId18"/>
                     <a:stretch>
                       <a:fillRect/>
                     </a:stretch>
@@ -7893,7 +7756,7 @@
         <w:drawing>
           <wp:inline xmlns:a="http://schemas.openxmlformats.org/drawingml/2006/main" xmlns:pic="http://schemas.openxmlformats.org/drawingml/2006/picture">
             <wp:extent cx="2955111" cy="960411"/>
-            <wp:docPr id="13" name="Picture 13"/>
+            <wp:docPr id="11" name="Picture 11"/>
             <wp:cNvGraphicFramePr>
               <a:graphicFrameLocks noChangeAspect="1"/>
             </wp:cNvGraphicFramePr>
@@ -7905,7 +7768,7 @@
                     <pic:cNvPicPr/>
                   </pic:nvPicPr>
                   <pic:blipFill>
-                    <a:blip r:embed="rId21"/>
+                    <a:blip r:embed="rId19"/>
                     <a:stretch>
                       <a:fillRect/>
                     </a:stretch>
@@ -8025,7 +7888,7 @@
               <w:drawing>
                 <wp:inline xmlns:a="http://schemas.openxmlformats.org/drawingml/2006/main" xmlns:pic="http://schemas.openxmlformats.org/drawingml/2006/picture">
                   <wp:extent cx="1208565" cy="1022632"/>
-                  <wp:docPr id="14" name="Picture 14"/>
+                  <wp:docPr id="12" name="Picture 12"/>
                   <wp:cNvGraphicFramePr>
                     <a:graphicFrameLocks noChangeAspect="1"/>
                   </wp:cNvGraphicFramePr>
@@ -8037,7 +7900,7 @@
                           <pic:cNvPicPr/>
                         </pic:nvPicPr>
                         <pic:blipFill>
-                          <a:blip r:embed="rId22"/>
+                          <a:blip r:embed="rId20"/>
                           <a:stretch>
                             <a:fillRect/>
                           </a:stretch>
@@ -8070,7 +7933,7 @@
               <w:drawing>
                 <wp:inline xmlns:a="http://schemas.openxmlformats.org/drawingml/2006/main" xmlns:pic="http://schemas.openxmlformats.org/drawingml/2006/picture">
                   <wp:extent cx="1533948" cy="1022632"/>
-                  <wp:docPr id="15" name="Picture 15"/>
+                  <wp:docPr id="13" name="Picture 13"/>
                   <wp:cNvGraphicFramePr>
                     <a:graphicFrameLocks noChangeAspect="1"/>
                   </wp:cNvGraphicFramePr>
@@ -8082,7 +7945,7 @@
                           <pic:cNvPicPr/>
                         </pic:nvPicPr>
                         <pic:blipFill>
-                          <a:blip r:embed="rId23"/>
+                          <a:blip r:embed="rId21"/>
                           <a:stretch>
                             <a:fillRect/>
                           </a:stretch>

</xml_diff>